<commit_message>
HotFix: Rename GameDesigner page into About Us page
</commit_message>
<xml_diff>
--- a/GDD/Fall into The Unknown.docx
+++ b/GDD/Fall into The Unknown.docx
@@ -2,381 +2,6 @@
 <file path=word/document.xml><?xml version="1.0" encoding="utf-8"?>
 <w:document xmlns:wpc="http://schemas.microsoft.com/office/word/2010/wordprocessingCanvas" xmlns:cx="http://schemas.microsoft.com/office/drawing/2014/chartex" xmlns:cx1="http://schemas.microsoft.com/office/drawing/2015/9/8/chartex" xmlns:cx2="http://schemas.microsoft.com/office/drawing/2015/10/21/chartex" xmlns:cx3="http://schemas.microsoft.com/office/drawing/2016/5/9/chartex" xmlns:cx4="http://schemas.microsoft.com/office/drawing/2016/5/10/chartex" xmlns:cx5="http://schemas.microsoft.com/office/drawing/2016/5/11/chartex" xmlns:cx6="http://schemas.microsoft.com/office/drawing/2016/5/12/chartex" xmlns:cx7="http://schemas.microsoft.com/office/drawing/2016/5/13/chartex" xmlns:cx8="http://schemas.microsoft.com/office/drawing/2016/5/14/chartex" xmlns:mc="http://schemas.openxmlformats.org/markup-compatibility/2006" xmlns:aink="http://schemas.microsoft.com/office/drawing/2016/ink" xmlns:am3d="http://schemas.microsoft.com/office/drawing/2017/model3d" xmlns:o="urn:schemas-microsoft-com:office:office" xmlns:oel="http://schemas.microsoft.com/office/2019/extlst" xmlns:r="http://schemas.openxmlformats.org/officeDocument/2006/relationships" xmlns:m="http://schemas.openxmlformats.org/officeDocument/2006/math" xmlns:v="urn:schemas-microsoft-com:vml" xmlns:wp14="http://schemas.microsoft.com/office/word/2010/wordprocessingDrawing" xmlns:wp="http://schemas.openxmlformats.org/drawingml/2006/wordprocessingDrawing" xmlns:w10="urn:schemas-microsoft-com:office:word" xmlns:w="http://schemas.openxmlformats.org/wordprocessingml/2006/main" xmlns:w14="http://schemas.microsoft.com/office/word/2010/wordml" xmlns:w15="http://schemas.microsoft.com/office/word/2012/wordml" xmlns:w16cex="http://schemas.microsoft.com/office/word/2018/wordml/cex" xmlns:w16cid="http://schemas.microsoft.com/office/word/2016/wordml/cid" xmlns:w16="http://schemas.microsoft.com/office/word/2018/wordml" xmlns:w16du="http://schemas.microsoft.com/office/word/2023/wordml/word16du" xmlns:w16sdtdh="http://schemas.microsoft.com/office/word/2020/wordml/sdtdatahash" xmlns:w16sdtfl="http://schemas.microsoft.com/office/word/2024/wordml/sdtformatlock" xmlns:w16se="http://schemas.microsoft.com/office/word/2015/wordml/symex" xmlns:wpg="http://schemas.microsoft.com/office/word/2010/wordprocessingGroup" xmlns:wpi="http://schemas.microsoft.com/office/word/2010/wordprocessingInk" xmlns:wne="http://schemas.microsoft.com/office/word/2006/wordml" xmlns:wps="http://schemas.microsoft.com/office/word/2010/wordprocessingShape" mc:Ignorable="w14 w15 w16se w16cid w16 w16cex w16sdtdh w16sdtfl w16du wp14">
   <w:body>
-    <w:tbl>
-      <w:tblPr>
-        <w:tblStyle w:val="TableGrid"/>
-        <w:tblW w:w="0" w:type="auto"/>
-        <w:tblLook w:val="04A0" w:firstRow="1" w:lastRow="0" w:firstColumn="1" w:lastColumn="0" w:noHBand="0" w:noVBand="1"/>
-      </w:tblPr>
-      <w:tblGrid>
-        <w:gridCol w:w="10456"/>
-      </w:tblGrid>
-      <w:tr>
-        <w:trPr>
-          <w:trHeight w:val="15300"/>
-        </w:trPr>
-        <w:tc>
-          <w:tcPr>
-            <w:tcW w:w="10456" w:type="dxa"/>
-            <w:tcBorders>
-              <w:top w:val="nil"/>
-              <w:left w:val="nil"/>
-              <w:bottom w:val="nil"/>
-              <w:right w:val="nil"/>
-            </w:tcBorders>
-            <w:vAlign w:val="center"/>
-          </w:tcPr>
-          <w:p>
-            <w:pPr>
-              <w:jc w:val="center"/>
-              <w:rPr>
-                <w:rFonts w:ascii="Verdana" w:hAnsi="Verdana"/>
-                <w:color w:val="FFFFFF" w:themeColor="background1"/>
-              </w:rPr>
-            </w:pPr>
-            <w:r>
-              <w:rPr>
-                <w:rFonts w:ascii="Verdana" w:hAnsi="Verdana"/>
-                <w:noProof/>
-                <w:color w:val="FFFFFF" w:themeColor="background1"/>
-              </w:rPr>
-              <w:drawing>
-                <wp:inline distT="0" distB="0" distL="0" distR="0" wp14:anchorId="1081CA9C" wp14:editId="187BF9BD">
-                  <wp:extent cx="4320000" cy="4320000"/>
-                  <wp:effectExtent l="0" t="0" r="0" b="0"/>
-                  <wp:docPr id="805185492" name="Picture 1"/>
-                  <wp:cNvGraphicFramePr>
-                    <a:graphicFrameLocks xmlns:a="http://schemas.openxmlformats.org/drawingml/2006/main" noChangeAspect="1"/>
-                  </wp:cNvGraphicFramePr>
-                  <a:graphic xmlns:a="http://schemas.openxmlformats.org/drawingml/2006/main">
-                    <a:graphicData uri="http://schemas.openxmlformats.org/drawingml/2006/picture">
-                      <pic:pic xmlns:pic="http://schemas.openxmlformats.org/drawingml/2006/picture">
-                        <pic:nvPicPr>
-                          <pic:cNvPr id="805185492" name="Picture 805185492"/>
-                          <pic:cNvPicPr/>
-                        </pic:nvPicPr>
-                        <pic:blipFill>
-                          <a:blip r:embed="rId8">
-                            <a:extLst>
-                              <a:ext uri="{28A0092B-C50C-407E-A947-70E740481C1C}">
-                                <a14:useLocalDpi xmlns:a14="http://schemas.microsoft.com/office/drawing/2010/main" val="0"/>
-                              </a:ext>
-                            </a:extLst>
-                          </a:blip>
-                          <a:stretch>
-                            <a:fillRect/>
-                          </a:stretch>
-                        </pic:blipFill>
-                        <pic:spPr>
-                          <a:xfrm>
-                            <a:off x="0" y="0"/>
-                            <a:ext cx="4320000" cy="4320000"/>
-                          </a:xfrm>
-                          <a:prstGeom prst="rect">
-                            <a:avLst/>
-                          </a:prstGeom>
-                        </pic:spPr>
-                      </pic:pic>
-                    </a:graphicData>
-                  </a:graphic>
-                </wp:inline>
-              </w:drawing>
-            </w:r>
-          </w:p>
-          <w:p>
-            <w:pPr>
-              <w:jc w:val="center"/>
-              <w:rPr>
-                <w:rFonts w:ascii="Verdana" w:hAnsi="Verdana"/>
-                <w:color w:val="FFFFFF" w:themeColor="background1"/>
-              </w:rPr>
-            </w:pPr>
-          </w:p>
-          <w:p>
-            <w:pPr>
-              <w:jc w:val="center"/>
-              <w:rPr>
-                <w:rFonts w:ascii="Verdana" w:hAnsi="Verdana"/>
-                <w:color w:val="FFFFFF" w:themeColor="background1"/>
-              </w:rPr>
-            </w:pPr>
-          </w:p>
-          <w:p>
-            <w:pPr>
-              <w:jc w:val="center"/>
-              <w:rPr>
-                <w:rFonts w:ascii="Verdana" w:hAnsi="Verdana"/>
-                <w:color w:val="FFFFFF" w:themeColor="background1"/>
-              </w:rPr>
-            </w:pPr>
-          </w:p>
-          <w:p>
-            <w:pPr>
-              <w:jc w:val="center"/>
-              <w:rPr>
-                <w:rFonts w:ascii="Verdana" w:hAnsi="Verdana"/>
-                <w:color w:val="FFFFFF" w:themeColor="background1"/>
-                <w:sz w:val="36"/>
-                <w:szCs w:val="36"/>
-              </w:rPr>
-            </w:pPr>
-            <w:r>
-              <w:rPr>
-                <w:rFonts w:ascii="Verdana" w:hAnsi="Verdana"/>
-                <w:color w:val="FFFFFF" w:themeColor="background1"/>
-                <w:sz w:val="36"/>
-                <w:szCs w:val="36"/>
-              </w:rPr>
-              <w:t>Fall Into the Unknown</w:t>
-            </w:r>
-          </w:p>
-          <w:p>
-            <w:pPr>
-              <w:jc w:val="center"/>
-              <w:rPr>
-                <w:rFonts w:ascii="Verdana" w:hAnsi="Verdana"/>
-                <w:color w:val="FFFFFF" w:themeColor="background1"/>
-              </w:rPr>
-            </w:pPr>
-          </w:p>
-          <w:p>
-            <w:pPr>
-              <w:jc w:val="center"/>
-              <w:rPr>
-                <w:rFonts w:ascii="Verdana" w:hAnsi="Verdana"/>
-                <w:color w:val="FFFFFF" w:themeColor="background1"/>
-              </w:rPr>
-            </w:pPr>
-            <w:r>
-              <w:rPr>
-                <w:rFonts w:ascii="Verdana" w:hAnsi="Verdana"/>
-                <w:color w:val="FFFFFF" w:themeColor="background1"/>
-              </w:rPr>
-              <w:t>Game Design Document</w:t>
-            </w:r>
-          </w:p>
-          <w:p>
-            <w:pPr>
-              <w:jc w:val="center"/>
-              <w:rPr>
-                <w:rFonts w:ascii="Verdana" w:hAnsi="Verdana"/>
-                <w:color w:val="FFFFFF" w:themeColor="background1"/>
-              </w:rPr>
-            </w:pPr>
-          </w:p>
-          <w:p>
-            <w:pPr>
-              <w:jc w:val="center"/>
-              <w:rPr>
-                <w:rFonts w:ascii="Verdana" w:hAnsi="Verdana"/>
-                <w:color w:val="FFFFFF" w:themeColor="background1"/>
-              </w:rPr>
-            </w:pPr>
-          </w:p>
-          <w:p>
-            <w:pPr>
-              <w:jc w:val="center"/>
-              <w:rPr>
-                <w:rFonts w:ascii="Verdana" w:hAnsi="Verdana"/>
-                <w:color w:val="FFFFFF" w:themeColor="background1"/>
-              </w:rPr>
-            </w:pPr>
-          </w:p>
-          <w:p>
-            <w:pPr>
-              <w:jc w:val="center"/>
-              <w:rPr>
-                <w:rFonts w:ascii="Verdana" w:hAnsi="Verdana"/>
-                <w:color w:val="FFFFFF" w:themeColor="background1"/>
-              </w:rPr>
-            </w:pPr>
-          </w:p>
-          <w:tbl>
-            <w:tblPr>
-              <w:tblStyle w:val="TableGrid"/>
-              <w:tblW w:w="0" w:type="auto"/>
-              <w:tblInd w:w="1024" w:type="dxa"/>
-              <w:tblLook w:val="04A0" w:firstRow="1" w:lastRow="0" w:firstColumn="1" w:lastColumn="0" w:noHBand="0" w:noVBand="1"/>
-            </w:tblPr>
-            <w:tblGrid>
-              <w:gridCol w:w="6378"/>
-            </w:tblGrid>
-            <w:tr>
-              <w:tc>
-                <w:tcPr>
-                  <w:tcW w:w="6378" w:type="dxa"/>
-                  <w:tcBorders>
-                    <w:top w:val="nil"/>
-                    <w:left w:val="nil"/>
-                    <w:bottom w:val="nil"/>
-                    <w:right w:val="nil"/>
-                  </w:tcBorders>
-                  <w:vAlign w:val="center"/>
-                </w:tcPr>
-                <w:p>
-                  <w:pPr>
-                    <w:rPr>
-                      <w:rFonts w:ascii="Verdana" w:hAnsi="Verdana"/>
-                      <w:color w:val="FFFFFF" w:themeColor="background1"/>
-                    </w:rPr>
-                  </w:pPr>
-                  <w:r>
-                    <w:rPr>
-                      <w:rFonts w:ascii="Verdana" w:hAnsi="Verdana"/>
-                      <w:color w:val="FFFFFF" w:themeColor="background1"/>
-                    </w:rPr>
-                    <w:t>Name: Khoo Zhong Jun</w:t>
-                  </w:r>
-                </w:p>
-                <w:p>
-                  <w:r>
-                    <w:rPr>
-                      <w:rFonts w:ascii="Verdana" w:hAnsi="Verdana"/>
-                      <w:color w:val="FFFFFF" w:themeColor="background1"/>
-                    </w:rPr>
-                    <w:t xml:space="preserve">Email: </w:t>
-                  </w:r>
-                  <w:hyperlink r:id="rId9" w:history="1">
-                    <w:r>
-                      <w:rPr>
-                        <w:rFonts w:ascii="Verdana" w:hAnsi="Verdana"/>
-                        <w:color w:val="FFFFFF" w:themeColor="background1"/>
-                      </w:rPr>
-                      <w:t>hfyzk4@nottingham.edu.my</w:t>
-                    </w:r>
-                  </w:hyperlink>
-                  <w:r>
-                    <w:rPr>
-                      <w:rFonts w:ascii="Verdana" w:hAnsi="Verdana"/>
-                      <w:color w:val="FFFFFF" w:themeColor="background1"/>
-                    </w:rPr>
-                    <w:t xml:space="preserve"> </w:t>
-                  </w:r>
-                </w:p>
-                <w:p>
-                  <w:pPr>
-                    <w:rPr>
-                      <w:rFonts w:ascii="Verdana" w:hAnsi="Verdana"/>
-                      <w:color w:val="FFFFFF" w:themeColor="background1"/>
-                    </w:rPr>
-                  </w:pPr>
-                  <w:r>
-                    <w:rPr>
-                      <w:rFonts w:ascii="Verdana" w:hAnsi="Verdana"/>
-                      <w:color w:val="FFFFFF" w:themeColor="background1"/>
-                    </w:rPr>
-                    <w:t>Date: 2/18/2026</w:t>
-                  </w:r>
-                </w:p>
-              </w:tc>
-            </w:tr>
-          </w:tbl>
-          <w:p>
-            <w:pPr>
-              <w:jc w:val="center"/>
-              <w:rPr>
-                <w:rFonts w:ascii="Verdana" w:hAnsi="Verdana"/>
-                <w:color w:val="FFFFFF" w:themeColor="background1"/>
-              </w:rPr>
-            </w:pPr>
-            <w:r>
-              <w:br w:type="page"/>
-            </w:r>
-          </w:p>
-        </w:tc>
-      </w:tr>
-    </w:tbl>
-    <w:p>
-      <w:pPr>
-        <w:rPr>
-          <w:sz w:val="2"/>
-          <w:szCs w:val="2"/>
-        </w:rPr>
-      </w:pPr>
-      <w:r>
-        <w:rPr>
-          <w:rFonts w:ascii="Verdana" w:hAnsi="Verdana"/>
-          <w:noProof/>
-          <w:color w:val="FFFFFF" w:themeColor="background1"/>
-          <w:sz w:val="2"/>
-          <w:szCs w:val="2"/>
-        </w:rPr>
-        <mc:AlternateContent>
-          <mc:Choice Requires="wps">
-            <w:drawing>
-              <wp:anchor distT="0" distB="0" distL="114300" distR="114300" simplePos="0" relativeHeight="251671552" behindDoc="1" locked="0" layoutInCell="1" allowOverlap="1" wp14:anchorId="03785C45" wp14:editId="2CE2ADFE">
-                <wp:simplePos x="0" y="0"/>
-                <wp:positionH relativeFrom="page">
-                  <wp:align>left</wp:align>
-                </wp:positionH>
-                <wp:positionV relativeFrom="paragraph">
-                  <wp:posOffset>-10278533</wp:posOffset>
-                </wp:positionV>
-                <wp:extent cx="7971692" cy="21122640"/>
-                <wp:effectExtent l="0" t="0" r="10795" b="22860"/>
-                <wp:wrapNone/>
-                <wp:docPr id="758062960" name="Rectangle 4"/>
-                <wp:cNvGraphicFramePr/>
-                <a:graphic xmlns:a="http://schemas.openxmlformats.org/drawingml/2006/main">
-                  <a:graphicData uri="http://schemas.microsoft.com/office/word/2010/wordprocessingShape">
-                    <wps:wsp>
-                      <wps:cNvSpPr/>
-                      <wps:spPr>
-                        <a:xfrm>
-                          <a:off x="0" y="0"/>
-                          <a:ext cx="7971692" cy="21122640"/>
-                        </a:xfrm>
-                        <a:prstGeom prst="rect">
-                          <a:avLst/>
-                        </a:prstGeom>
-                        <a:solidFill>
-                          <a:srgbClr val="1A1A1A"/>
-                        </a:solidFill>
-                      </wps:spPr>
-                      <wps:style>
-                        <a:lnRef idx="2">
-                          <a:schemeClr val="accent1">
-                            <a:shade val="15000"/>
-                          </a:schemeClr>
-                        </a:lnRef>
-                        <a:fillRef idx="1">
-                          <a:schemeClr val="accent1"/>
-                        </a:fillRef>
-                        <a:effectRef idx="0">
-                          <a:schemeClr val="accent1"/>
-                        </a:effectRef>
-                        <a:fontRef idx="minor">
-                          <a:schemeClr val="lt1"/>
-                        </a:fontRef>
-                      </wps:style>
-                      <wps:bodyPr rot="0" spcFirstLastPara="0" vertOverflow="overflow" horzOverflow="overflow" vert="horz" wrap="square" lIns="91440" tIns="45720" rIns="91440" bIns="45720" numCol="1" spcCol="0" rtlCol="0" fromWordArt="0" anchor="ctr" anchorCtr="0" forceAA="0" compatLnSpc="1">
-                        <a:prstTxWarp prst="textNoShape">
-                          <a:avLst/>
-                        </a:prstTxWarp>
-                        <a:noAutofit/>
-                      </wps:bodyPr>
-                    </wps:wsp>
-                  </a:graphicData>
-                </a:graphic>
-                <wp14:sizeRelH relativeFrom="margin">
-                  <wp14:pctWidth>0</wp14:pctWidth>
-                </wp14:sizeRelH>
-                <wp14:sizeRelV relativeFrom="margin">
-                  <wp14:pctHeight>0</wp14:pctHeight>
-                </wp14:sizeRelV>
-              </wp:anchor>
-            </w:drawing>
-          </mc:Choice>
-          <mc:Fallback>
-            <w:pict>
-              <v:rect w14:anchorId="4ADB7D67" id="Rectangle 4" o:spid="_x0000_s1026" style="position:absolute;margin-left:0;margin-top:-809.35pt;width:627.7pt;height:1663.2pt;z-index:-251644928;visibility:visible;mso-wrap-style:square;mso-width-percent:0;mso-height-percent:0;mso-wrap-distance-left:9pt;mso-wrap-distance-top:0;mso-wrap-distance-right:9pt;mso-wrap-distance-bottom:0;mso-position-horizontal:left;mso-position-horizontal-relative:page;mso-position-vertical:absolute;mso-position-vertical-relative:text;mso-width-percent:0;mso-height-percent:0;mso-width-relative:margin;mso-height-relative:margin;v-text-anchor:middle" o:gfxdata="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" fillcolor="#1a1a1a" strokecolor="#030e13 [484]" strokeweight="1pt">
-                <w10:wrap anchorx="page"/>
-              </v:rect>
-            </w:pict>
-          </mc:Fallback>
-        </mc:AlternateContent>
-      </w:r>
-    </w:p>
     <w:tbl>
       <w:tblPr>
         <w:tblStyle w:val="TableGrid"/>
@@ -418,7 +43,6 @@
                 <w:sz w:val="28"/>
                 <w:szCs w:val="28"/>
               </w:rPr>
-              <w:lastRenderedPageBreak/>
               <w:t xml:space="preserve">Fall </w:t>
             </w:r>
             <w:r>
@@ -542,13 +166,7 @@
               <w:rPr>
                 <w:rFonts w:ascii="Times New Roman" w:hAnsi="Times New Roman" w:cs="Times New Roman"/>
               </w:rPr>
-              <w:t>– Survive</w:t>
-            </w:r>
-            <w:r>
-              <w:rPr>
-                <w:rFonts w:ascii="Times New Roman" w:hAnsi="Times New Roman" w:cs="Times New Roman"/>
-              </w:rPr>
-              <w:t xml:space="preserve"> – </w:t>
+              <w:t xml:space="preserve">– Survive – </w:t>
             </w:r>
             <w:proofErr w:type="gramStart"/>
             <w:r>
@@ -648,7 +266,7 @@
                 <w:sz w:val="21"/>
                 <w:szCs w:val="21"/>
               </w:rPr>
-              <w:t>various skill and enemies</w:t>
+              <w:t>various skill and enemies. Defeat waves of enemies,</w:t>
             </w:r>
             <w:r>
               <w:rPr>
@@ -656,7 +274,7 @@
                 <w:sz w:val="21"/>
                 <w:szCs w:val="21"/>
               </w:rPr>
-              <w:t>.</w:t>
+              <w:t xml:space="preserve"> </w:t>
             </w:r>
             <w:r>
               <w:rPr>
@@ -664,7 +282,7 @@
                 <w:sz w:val="21"/>
                 <w:szCs w:val="21"/>
               </w:rPr>
-              <w:t xml:space="preserve"> </w:t>
+              <w:t>challenge complex creatures, earn victory rewards, and updates game character</w:t>
             </w:r>
             <w:r>
               <w:rPr>
@@ -672,87 +290,7 @@
                 <w:sz w:val="21"/>
                 <w:szCs w:val="21"/>
               </w:rPr>
-              <w:t>D</w:t>
-            </w:r>
-            <w:r>
-              <w:rPr>
-                <w:rFonts w:asciiTheme="majorHAnsi" w:hAnsiTheme="majorHAnsi"/>
-                <w:sz w:val="21"/>
-                <w:szCs w:val="21"/>
-              </w:rPr>
-              <w:t>efeat waves of enemies,</w:t>
-            </w:r>
-            <w:r>
-              <w:rPr>
-                <w:rFonts w:asciiTheme="majorHAnsi" w:hAnsiTheme="majorHAnsi"/>
-                <w:sz w:val="21"/>
-                <w:szCs w:val="21"/>
-              </w:rPr>
-              <w:t xml:space="preserve"> </w:t>
-            </w:r>
-            <w:r>
-              <w:rPr>
-                <w:rFonts w:asciiTheme="majorHAnsi" w:hAnsiTheme="majorHAnsi"/>
-                <w:sz w:val="21"/>
-                <w:szCs w:val="21"/>
-              </w:rPr>
-              <w:t xml:space="preserve">challenge </w:t>
-            </w:r>
-            <w:r>
-              <w:rPr>
-                <w:rFonts w:asciiTheme="majorHAnsi" w:hAnsiTheme="majorHAnsi"/>
-                <w:sz w:val="21"/>
-                <w:szCs w:val="21"/>
-              </w:rPr>
-              <w:t xml:space="preserve">complex creatures, </w:t>
-            </w:r>
-            <w:r>
-              <w:rPr>
-                <w:rFonts w:asciiTheme="majorHAnsi" w:hAnsiTheme="majorHAnsi"/>
-                <w:sz w:val="21"/>
-                <w:szCs w:val="21"/>
-              </w:rPr>
-              <w:t xml:space="preserve">earn victory rewards, </w:t>
-            </w:r>
-            <w:r>
-              <w:rPr>
-                <w:rFonts w:asciiTheme="majorHAnsi" w:hAnsiTheme="majorHAnsi"/>
-                <w:sz w:val="21"/>
-                <w:szCs w:val="21"/>
-              </w:rPr>
-              <w:t xml:space="preserve">and updates </w:t>
-            </w:r>
-            <w:r>
-              <w:rPr>
-                <w:rFonts w:asciiTheme="majorHAnsi" w:hAnsiTheme="majorHAnsi"/>
-                <w:sz w:val="21"/>
-                <w:szCs w:val="21"/>
-              </w:rPr>
-              <w:t>game</w:t>
-            </w:r>
-            <w:r>
-              <w:rPr>
-                <w:rFonts w:asciiTheme="majorHAnsi" w:hAnsiTheme="majorHAnsi"/>
-                <w:sz w:val="21"/>
-                <w:szCs w:val="21"/>
-              </w:rPr>
-              <w:t xml:space="preserve"> character</w:t>
-            </w:r>
-            <w:r>
-              <w:rPr>
-                <w:rFonts w:asciiTheme="majorHAnsi" w:hAnsiTheme="majorHAnsi"/>
-                <w:sz w:val="21"/>
-                <w:szCs w:val="21"/>
-              </w:rPr>
-              <w:t>.</w:t>
-            </w:r>
-            <w:r>
-              <w:rPr>
-                <w:rFonts w:asciiTheme="majorHAnsi" w:hAnsiTheme="majorHAnsi"/>
-                <w:sz w:val="21"/>
-                <w:szCs w:val="21"/>
-              </w:rPr>
-              <w:t xml:space="preserve"> </w:t>
+              <w:t xml:space="preserve">. </w:t>
             </w:r>
           </w:p>
         </w:tc>
@@ -823,7 +361,7 @@
                           <pic:cNvPicPr/>
                         </pic:nvPicPr>
                         <pic:blipFill>
-                          <a:blip r:embed="rId10" cstate="print">
+                          <a:blip r:embed="rId8" cstate="print">
                             <a:extLst>
                               <a:ext uri="{28A0092B-C50C-407E-A947-70E740481C1C}">
                                 <a14:useLocalDpi xmlns:a14="http://schemas.microsoft.com/office/drawing/2010/main" val="0"/>
@@ -909,7 +447,7 @@
                           <pic:cNvPicPr/>
                         </pic:nvPicPr>
                         <pic:blipFill>
-                          <a:blip r:embed="rId11"/>
+                          <a:blip r:embed="rId9"/>
                           <a:stretch>
                             <a:fillRect/>
                           </a:stretch>
@@ -1008,7 +546,7 @@
                           <pic:cNvPicPr/>
                         </pic:nvPicPr>
                         <pic:blipFill>
-                          <a:blip r:embed="rId12"/>
+                          <a:blip r:embed="rId10"/>
                           <a:stretch>
                             <a:fillRect/>
                           </a:stretch>
@@ -1554,7 +1092,7 @@
                           <pic:cNvPicPr/>
                         </pic:nvPicPr>
                         <pic:blipFill>
-                          <a:blip r:embed="rId13"/>
+                          <a:blip r:embed="rId11"/>
                           <a:stretch>
                             <a:fillRect/>
                           </a:stretch>
@@ -1678,7 +1216,7 @@
                           </pic:cNvPicPr>
                         </pic:nvPicPr>
                         <pic:blipFill>
-                          <a:blip r:embed="rId14" cstate="print">
+                          <a:blip r:embed="rId12" cstate="print">
                             <a:extLst>
                               <a:ext uri="{28A0092B-C50C-407E-A947-70E740481C1C}">
                                 <a14:useLocalDpi xmlns:a14="http://schemas.microsoft.com/office/drawing/2010/main" val="0"/>
@@ -1761,7 +1299,7 @@
                           <pic:cNvPicPr/>
                         </pic:nvPicPr>
                         <pic:blipFill>
-                          <a:blip r:embed="rId15" cstate="print">
+                          <a:blip r:embed="rId13" cstate="print">
                             <a:extLst>
                               <a:ext uri="{28A0092B-C50C-407E-A947-70E740481C1C}">
                                 <a14:useLocalDpi xmlns:a14="http://schemas.microsoft.com/office/drawing/2010/main" val="0"/>
@@ -2012,13 +1550,17 @@
             <w:pPr>
               <w:jc w:val="center"/>
               <w:rPr>
-                <w:noProof/>
-                <w:sz w:val="21"/>
-                <w:szCs w:val="21"/>
-              </w:rPr>
-            </w:pPr>
-            <w:r>
-              <w:rPr>
+                <w:b/>
+                <w:bCs/>
+                <w:noProof/>
+                <w:sz w:val="21"/>
+                <w:szCs w:val="21"/>
+              </w:rPr>
+            </w:pPr>
+            <w:r>
+              <w:rPr>
+                <w:b/>
+                <w:bCs/>
                 <w:noProof/>
                 <w:sz w:val="21"/>
                 <w:szCs w:val="21"/>
@@ -2036,13 +1578,17 @@
             <w:pPr>
               <w:jc w:val="center"/>
               <w:rPr>
-                <w:noProof/>
-                <w:sz w:val="21"/>
-                <w:szCs w:val="21"/>
-              </w:rPr>
-            </w:pPr>
-            <w:r>
-              <w:rPr>
+                <w:b/>
+                <w:bCs/>
+                <w:noProof/>
+                <w:sz w:val="21"/>
+                <w:szCs w:val="21"/>
+              </w:rPr>
+            </w:pPr>
+            <w:r>
+              <w:rPr>
+                <w:b/>
+                <w:bCs/>
                 <w:noProof/>
                 <w:sz w:val="21"/>
                 <w:szCs w:val="21"/>
@@ -2060,13 +1606,17 @@
             <w:pPr>
               <w:jc w:val="center"/>
               <w:rPr>
-                <w:noProof/>
-                <w:sz w:val="21"/>
-                <w:szCs w:val="21"/>
-              </w:rPr>
-            </w:pPr>
-            <w:r>
-              <w:rPr>
+                <w:b/>
+                <w:bCs/>
+                <w:noProof/>
+                <w:sz w:val="21"/>
+                <w:szCs w:val="21"/>
+              </w:rPr>
+            </w:pPr>
+            <w:r>
+              <w:rPr>
+                <w:b/>
+                <w:bCs/>
                 <w:noProof/>
                 <w:sz w:val="21"/>
                 <w:szCs w:val="21"/>
@@ -2084,13 +1634,17 @@
             <w:pPr>
               <w:jc w:val="center"/>
               <w:rPr>
-                <w:noProof/>
-                <w:sz w:val="21"/>
-                <w:szCs w:val="21"/>
-              </w:rPr>
-            </w:pPr>
-            <w:r>
-              <w:rPr>
+                <w:b/>
+                <w:bCs/>
+                <w:noProof/>
+                <w:sz w:val="21"/>
+                <w:szCs w:val="21"/>
+              </w:rPr>
+            </w:pPr>
+            <w:r>
+              <w:rPr>
+                <w:b/>
+                <w:bCs/>
                 <w:noProof/>
                 <w:sz w:val="21"/>
                 <w:szCs w:val="21"/>
@@ -2099,6 +1653,8 @@
             </w:r>
             <w:r>
               <w:rPr>
+                <w:b/>
+                <w:bCs/>
                 <w:noProof/>
                 <w:sz w:val="21"/>
                 <w:szCs w:val="21"/>
@@ -2141,7 +1697,7 @@
                 <w:noProof/>
               </w:rPr>
               <w:drawing>
-                <wp:inline distT="0" distB="0" distL="0" distR="0" wp14:anchorId="0F2A3BAA" wp14:editId="541E3C20">
+                <wp:inline distT="0" distB="0" distL="0" distR="0" wp14:anchorId="0F2A3BAA" wp14:editId="318FBF45">
                   <wp:extent cx="289560" cy="190500"/>
                   <wp:effectExtent l="0" t="0" r="0" b="0"/>
                   <wp:docPr id="1156771017" name="Picture 10"/>
@@ -2158,7 +1714,7 @@
                           </pic:cNvPicPr>
                         </pic:nvPicPr>
                         <pic:blipFill>
-                          <a:blip r:embed="rId16" cstate="print">
+                          <a:blip r:embed="rId14" cstate="print">
                             <a:extLst>
                               <a:ext uri="{28A0092B-C50C-407E-A947-70E740481C1C}">
                                 <a14:useLocalDpi xmlns:a14="http://schemas.microsoft.com/office/drawing/2010/main" val="0"/>
@@ -2209,7 +1765,7 @@
                 <w:noProof/>
               </w:rPr>
               <w:drawing>
-                <wp:inline distT="0" distB="0" distL="0" distR="0" wp14:anchorId="2F271EA2" wp14:editId="281F4EC9">
+                <wp:inline distT="0" distB="0" distL="0" distR="0" wp14:anchorId="2F271EA2" wp14:editId="00FAD37B">
                   <wp:extent cx="289560" cy="190500"/>
                   <wp:effectExtent l="0" t="0" r="0" b="0"/>
                   <wp:docPr id="100582707" name="Picture 8"/>
@@ -2226,7 +1782,7 @@
                           </pic:cNvPicPr>
                         </pic:nvPicPr>
                         <pic:blipFill>
-                          <a:blip r:embed="rId17" cstate="print">
+                          <a:blip r:embed="rId15" cstate="print">
                             <a:extLst>
                               <a:ext uri="{28A0092B-C50C-407E-A947-70E740481C1C}">
                                 <a14:useLocalDpi xmlns:a14="http://schemas.microsoft.com/office/drawing/2010/main" val="0"/>
@@ -2293,7 +1849,7 @@
                           </pic:cNvPicPr>
                         </pic:nvPicPr>
                         <pic:blipFill>
-                          <a:blip r:embed="rId18" cstate="print">
+                          <a:blip r:embed="rId16" cstate="print">
                             <a:extLst>
                               <a:ext uri="{28A0092B-C50C-407E-A947-70E740481C1C}">
                                 <a14:useLocalDpi xmlns:a14="http://schemas.microsoft.com/office/drawing/2010/main" val="0"/>
@@ -2343,7 +1899,7 @@
                 <w:noProof/>
               </w:rPr>
               <w:drawing>
-                <wp:inline distT="0" distB="0" distL="0" distR="0" wp14:anchorId="573A5416" wp14:editId="523721FA">
+                <wp:inline distT="0" distB="0" distL="0" distR="0" wp14:anchorId="573A5416" wp14:editId="72960997">
                   <wp:extent cx="899160" cy="601980"/>
                   <wp:effectExtent l="0" t="0" r="0" b="7620"/>
                   <wp:docPr id="338436472" name="Picture 9"/>
@@ -2360,7 +1916,7 @@
                           </pic:cNvPicPr>
                         </pic:nvPicPr>
                         <pic:blipFill>
-                          <a:blip r:embed="rId19" cstate="print">
+                          <a:blip r:embed="rId17" cstate="print">
                             <a:extLst>
                               <a:ext uri="{28A0092B-C50C-407E-A947-70E740481C1C}">
                                 <a14:useLocalDpi xmlns:a14="http://schemas.microsoft.com/office/drawing/2010/main" val="0"/>
@@ -2841,13 +2397,17 @@
             <w:pPr>
               <w:jc w:val="center"/>
               <w:rPr>
-                <w:noProof/>
-                <w:sz w:val="21"/>
-                <w:szCs w:val="21"/>
-              </w:rPr>
-            </w:pPr>
-            <w:r>
-              <w:rPr>
+                <w:b/>
+                <w:bCs/>
+                <w:noProof/>
+                <w:sz w:val="21"/>
+                <w:szCs w:val="21"/>
+              </w:rPr>
+            </w:pPr>
+            <w:r>
+              <w:rPr>
+                <w:b/>
+                <w:bCs/>
                 <w:noProof/>
                 <w:sz w:val="21"/>
                 <w:szCs w:val="21"/>
@@ -2865,13 +2425,17 @@
             <w:pPr>
               <w:jc w:val="center"/>
               <w:rPr>
-                <w:noProof/>
-                <w:sz w:val="21"/>
-                <w:szCs w:val="21"/>
-              </w:rPr>
-            </w:pPr>
-            <w:r>
-              <w:rPr>
+                <w:b/>
+                <w:bCs/>
+                <w:noProof/>
+                <w:sz w:val="21"/>
+                <w:szCs w:val="21"/>
+              </w:rPr>
+            </w:pPr>
+            <w:r>
+              <w:rPr>
+                <w:b/>
+                <w:bCs/>
                 <w:noProof/>
                 <w:sz w:val="21"/>
                 <w:szCs w:val="21"/>
@@ -2889,13 +2453,17 @@
             <w:pPr>
               <w:jc w:val="center"/>
               <w:rPr>
-                <w:noProof/>
-                <w:sz w:val="21"/>
-                <w:szCs w:val="21"/>
-              </w:rPr>
-            </w:pPr>
-            <w:r>
-              <w:rPr>
+                <w:b/>
+                <w:bCs/>
+                <w:noProof/>
+                <w:sz w:val="21"/>
+                <w:szCs w:val="21"/>
+              </w:rPr>
+            </w:pPr>
+            <w:r>
+              <w:rPr>
+                <w:b/>
+                <w:bCs/>
                 <w:noProof/>
                 <w:sz w:val="21"/>
                 <w:szCs w:val="21"/>
@@ -3373,13 +2941,17 @@
             <w:pPr>
               <w:jc w:val="center"/>
               <w:rPr>
-                <w:noProof/>
-                <w:sz w:val="21"/>
-                <w:szCs w:val="21"/>
-              </w:rPr>
-            </w:pPr>
-            <w:r>
-              <w:rPr>
+                <w:b/>
+                <w:bCs/>
+                <w:noProof/>
+                <w:sz w:val="21"/>
+                <w:szCs w:val="21"/>
+              </w:rPr>
+            </w:pPr>
+            <w:r>
+              <w:rPr>
+                <w:b/>
+                <w:bCs/>
                 <w:noProof/>
                 <w:sz w:val="21"/>
                 <w:szCs w:val="21"/>
@@ -3397,13 +2969,17 @@
             <w:pPr>
               <w:jc w:val="center"/>
               <w:rPr>
-                <w:noProof/>
-                <w:sz w:val="21"/>
-                <w:szCs w:val="21"/>
-              </w:rPr>
-            </w:pPr>
-            <w:r>
-              <w:rPr>
+                <w:b/>
+                <w:bCs/>
+                <w:noProof/>
+                <w:sz w:val="21"/>
+                <w:szCs w:val="21"/>
+              </w:rPr>
+            </w:pPr>
+            <w:r>
+              <w:rPr>
+                <w:b/>
+                <w:bCs/>
                 <w:noProof/>
                 <w:sz w:val="21"/>
                 <w:szCs w:val="21"/>
@@ -3415,19 +2991,23 @@
         <w:tc>
           <w:tcPr>
             <w:tcW w:w="3104" w:type="dxa"/>
-            <w:vAlign w:val="center"/>
+            <w:vAlign w:val="bottom"/>
           </w:tcPr>
           <w:p>
             <w:pPr>
               <w:jc w:val="center"/>
               <w:rPr>
-                <w:noProof/>
-                <w:sz w:val="21"/>
-                <w:szCs w:val="21"/>
-              </w:rPr>
-            </w:pPr>
-            <w:r>
-              <w:rPr>
+                <w:b/>
+                <w:bCs/>
+                <w:noProof/>
+                <w:sz w:val="21"/>
+                <w:szCs w:val="21"/>
+              </w:rPr>
+            </w:pPr>
+            <w:r>
+              <w:rPr>
+                <w:b/>
+                <w:bCs/>
                 <w:noProof/>
                 <w:sz w:val="21"/>
                 <w:szCs w:val="21"/>
@@ -3488,7 +3068,7 @@
                           </pic:cNvPicPr>
                         </pic:nvPicPr>
                         <pic:blipFill>
-                          <a:blip r:embed="rId20">
+                          <a:blip r:embed="rId18">
                             <a:extLst>
                               <a:ext uri="{28A0092B-C50C-407E-A947-70E740481C1C}">
                                 <a14:useLocalDpi xmlns:a14="http://schemas.microsoft.com/office/drawing/2010/main" val="0"/>
@@ -3556,7 +3136,7 @@
                           </pic:cNvPicPr>
                         </pic:nvPicPr>
                         <pic:blipFill>
-                          <a:blip r:embed="rId21">
+                          <a:blip r:embed="rId19">
                             <a:extLst>
                               <a:ext uri="{28A0092B-C50C-407E-A947-70E740481C1C}">
                                 <a14:useLocalDpi xmlns:a14="http://schemas.microsoft.com/office/drawing/2010/main" val="0"/>
@@ -3623,7 +3203,7 @@
                           </pic:cNvPicPr>
                         </pic:nvPicPr>
                         <pic:blipFill>
-                          <a:blip r:embed="rId22">
+                          <a:blip r:embed="rId20">
                             <a:extLst>
                               <a:ext uri="{28A0092B-C50C-407E-A947-70E740481C1C}">
                                 <a14:useLocalDpi xmlns:a14="http://schemas.microsoft.com/office/drawing/2010/main" val="0"/>
@@ -4057,19 +3637,77 @@
     </w:p>
     <w:p>
       <w:pPr>
+        <w:spacing w:after="0"/>
         <w:rPr>
           <w:sz w:val="21"/>
           <w:szCs w:val="21"/>
         </w:rPr>
       </w:pPr>
     </w:p>
+    <w:p>
+      <w:pPr>
+        <w:spacing w:after="0"/>
+        <w:rPr>
+          <w:sz w:val="21"/>
+          <w:szCs w:val="21"/>
+        </w:rPr>
+      </w:pPr>
+      <w:r>
+        <w:rPr>
+          <w:sz w:val="21"/>
+          <w:szCs w:val="21"/>
+        </w:rPr>
+        <w:t>GitHub:</w:t>
+      </w:r>
+      <w:r>
+        <w:rPr>
+          <w:i/>
+          <w:iCs/>
+          <w:sz w:val="21"/>
+          <w:szCs w:val="21"/>
+        </w:rPr>
+        <w:t xml:space="preserve"> </w:t>
+      </w:r>
+      <w:hyperlink r:id="rId21" w:history="1">
+        <w:r>
+          <w:rPr>
+            <w:rStyle w:val="Hyperlink"/>
+            <w:i/>
+            <w:iCs/>
+            <w:sz w:val="21"/>
+            <w:szCs w:val="21"/>
+          </w:rPr>
+          <w:t>https://git</w:t>
+        </w:r>
+        <w:r>
+          <w:rPr>
+            <w:rStyle w:val="Hyperlink"/>
+            <w:i/>
+            <w:iCs/>
+            <w:sz w:val="21"/>
+            <w:szCs w:val="21"/>
+          </w:rPr>
+          <w:t>h</w:t>
+        </w:r>
+        <w:r>
+          <w:rPr>
+            <w:rStyle w:val="Hyperlink"/>
+            <w:i/>
+            <w:iCs/>
+            <w:sz w:val="21"/>
+            <w:szCs w:val="21"/>
+          </w:rPr>
+          <w:t>ub.com/Repeating1212/Fall-Into-the-Unknown</w:t>
+        </w:r>
+      </w:hyperlink>
+    </w:p>
     <w:sectPr>
-      <w:headerReference w:type="even" r:id="rId23"/>
-      <w:headerReference w:type="default" r:id="rId24"/>
-      <w:footerReference w:type="even" r:id="rId25"/>
-      <w:footerReference w:type="default" r:id="rId26"/>
-      <w:headerReference w:type="first" r:id="rId27"/>
-      <w:footerReference w:type="first" r:id="rId28"/>
+      <w:headerReference w:type="even" r:id="rId22"/>
+      <w:headerReference w:type="default" r:id="rId23"/>
+      <w:footerReference w:type="even" r:id="rId24"/>
+      <w:footerReference w:type="default" r:id="rId25"/>
+      <w:headerReference w:type="first" r:id="rId26"/>
+      <w:footerReference w:type="first" r:id="rId27"/>
       <w:pgSz w:w="11906" w:h="16838"/>
       <w:pgMar w:top="720" w:right="720" w:bottom="720" w:left="720" w:header="227" w:footer="283" w:gutter="0"/>
       <w:pgBorders w:display="notFirstPage" w:offsetFrom="page">
@@ -6520,6 +6158,18 @@
       <w:shd w:val="clear" w:color="auto" w:fill="E1DFDD"/>
     </w:rPr>
   </w:style>
+  <w:style w:type="character" w:styleId="FollowedHyperlink">
+    <w:name w:val="FollowedHyperlink"/>
+    <w:basedOn w:val="DefaultParagraphFont"/>
+    <w:uiPriority w:val="99"/>
+    <w:semiHidden/>
+    <w:unhideWhenUsed/>
+    <w:rsid w:val="009406F1"/>
+    <w:rPr>
+      <w:color w:val="96607D" w:themeColor="followedHyperlink"/>
+      <w:u w:val="single"/>
+    </w:rPr>
+  </w:style>
 </w:styles>
 </file>
 

</xml_diff>

<commit_message>
Fix: Update GDD Document
</commit_message>
<xml_diff>
--- a/GDD/Fall into The Unknown.docx
+++ b/GDD/Fall into The Unknown.docx
@@ -1697,7 +1697,7 @@
                 <w:noProof/>
               </w:rPr>
               <w:drawing>
-                <wp:inline distT="0" distB="0" distL="0" distR="0" wp14:anchorId="0F2A3BAA" wp14:editId="318FBF45">
+                <wp:inline distT="0" distB="0" distL="0" distR="0" wp14:anchorId="0F2A3BAA" wp14:editId="3B3B785E">
                   <wp:extent cx="289560" cy="190500"/>
                   <wp:effectExtent l="0" t="0" r="0" b="0"/>
                   <wp:docPr id="1156771017" name="Picture 10"/>
@@ -1765,7 +1765,7 @@
                 <w:noProof/>
               </w:rPr>
               <w:drawing>
-                <wp:inline distT="0" distB="0" distL="0" distR="0" wp14:anchorId="2F271EA2" wp14:editId="00FAD37B">
+                <wp:inline distT="0" distB="0" distL="0" distR="0" wp14:anchorId="2F271EA2" wp14:editId="1B5C33C9">
                   <wp:extent cx="289560" cy="190500"/>
                   <wp:effectExtent l="0" t="0" r="0" b="0"/>
                   <wp:docPr id="100582707" name="Picture 8"/>
@@ -1899,7 +1899,7 @@
                 <w:noProof/>
               </w:rPr>
               <w:drawing>
-                <wp:inline distT="0" distB="0" distL="0" distR="0" wp14:anchorId="573A5416" wp14:editId="72960997">
+                <wp:inline distT="0" distB="0" distL="0" distR="0" wp14:anchorId="573A5416" wp14:editId="0CC27702">
                   <wp:extent cx="899160" cy="601980"/>
                   <wp:effectExtent l="0" t="0" r="0" b="7620"/>
                   <wp:docPr id="338436472" name="Picture 9"/>
@@ -2213,8 +2213,9 @@
       </w:tblPr>
       <w:tblGrid>
         <w:gridCol w:w="618"/>
-        <w:gridCol w:w="3289"/>
-        <w:gridCol w:w="3289"/>
+        <w:gridCol w:w="2192"/>
+        <w:gridCol w:w="2193"/>
+        <w:gridCol w:w="2193"/>
         <w:gridCol w:w="3289"/>
       </w:tblGrid>
       <w:tr>
@@ -2244,7 +2245,7 @@
               <mc:AlternateContent>
                 <mc:Choice Requires="wps">
                   <w:drawing>
-                    <wp:anchor distT="45720" distB="45720" distL="114300" distR="114300" simplePos="0" relativeHeight="251667456" behindDoc="0" locked="0" layoutInCell="1" allowOverlap="1" wp14:anchorId="7AF855D4" wp14:editId="2401AC70">
+                    <wp:anchor distT="45720" distB="45720" distL="114300" distR="114300" simplePos="0" relativeHeight="251671552" behindDoc="0" locked="0" layoutInCell="1" allowOverlap="1" wp14:anchorId="7AF855D4" wp14:editId="2401AC70">
                       <wp:simplePos x="0" y="0"/>
                       <wp:positionH relativeFrom="margin">
                         <wp:posOffset>-304165</wp:posOffset>
@@ -2330,7 +2331,7 @@
                 </mc:Choice>
                 <mc:Fallback>
                   <w:pict>
-                    <v:shape w14:anchorId="7AF855D4" id="_x0000_s1027" type="#_x0000_t202" style="position:absolute;margin-left:-23.95pt;margin-top:-58.7pt;width:68.45pt;height:19.8pt;rotation:-90;flip:x y;z-index:251667456;visibility:visible;mso-wrap-style:square;mso-width-percent:0;mso-height-percent:0;mso-wrap-distance-left:9pt;mso-wrap-distance-top:3.6pt;mso-wrap-distance-right:9pt;mso-wrap-distance-bottom:3.6pt;mso-position-horizontal:absolute;mso-position-horizontal-relative:margin;mso-position-vertical:absolute;mso-position-vertical-relative:text;mso-width-percent:0;mso-height-percent:0;mso-width-relative:margin;mso-height-relative:margin;v-text-anchor:middle" o:gfxdata="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" filled="f" stroked="f">
+                    <v:shape w14:anchorId="7AF855D4" id="_x0000_s1027" type="#_x0000_t202" style="position:absolute;margin-left:-23.95pt;margin-top:-58.7pt;width:68.45pt;height:19.8pt;rotation:-90;flip:x y;z-index:251671552;visibility:visible;mso-wrap-style:square;mso-width-percent:0;mso-height-percent:0;mso-wrap-distance-left:9pt;mso-wrap-distance-top:3.6pt;mso-wrap-distance-right:9pt;mso-wrap-distance-bottom:3.6pt;mso-position-horizontal:absolute;mso-position-horizontal-relative:margin;mso-position-vertical:absolute;mso-position-vertical-relative:text;mso-width-percent:0;mso-height-percent:0;mso-width-relative:margin;mso-height-relative:margin;v-text-anchor:middle" o:gfxdata="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" filled="f" stroked="f">
                       <v:textbox>
                         <w:txbxContent>
                           <w:p>
@@ -2390,7 +2391,7 @@
         </w:tc>
         <w:tc>
           <w:tcPr>
-            <w:tcW w:w="3289" w:type="dxa"/>
+            <w:tcW w:w="2192" w:type="dxa"/>
             <w:vAlign w:val="bottom"/>
           </w:tcPr>
           <w:p>
@@ -2413,6 +2414,72 @@
                 <w:szCs w:val="21"/>
               </w:rPr>
               <w:t>Wave 1</w:t>
+            </w:r>
+          </w:p>
+        </w:tc>
+        <w:tc>
+          <w:tcPr>
+            <w:tcW w:w="2193" w:type="dxa"/>
+            <w:vAlign w:val="bottom"/>
+          </w:tcPr>
+          <w:p>
+            <w:pPr>
+              <w:jc w:val="center"/>
+              <w:rPr>
+                <w:b/>
+                <w:bCs/>
+                <w:noProof/>
+                <w:sz w:val="21"/>
+                <w:szCs w:val="21"/>
+              </w:rPr>
+            </w:pPr>
+            <w:r>
+              <w:rPr>
+                <w:b/>
+                <w:bCs/>
+                <w:noProof/>
+                <w:sz w:val="21"/>
+                <w:szCs w:val="21"/>
+              </w:rPr>
+              <w:t>Wave 2</w:t>
+            </w:r>
+          </w:p>
+        </w:tc>
+        <w:tc>
+          <w:tcPr>
+            <w:tcW w:w="2193" w:type="dxa"/>
+            <w:vAlign w:val="bottom"/>
+          </w:tcPr>
+          <w:p>
+            <w:pPr>
+              <w:jc w:val="center"/>
+              <w:rPr>
+                <w:b/>
+                <w:bCs/>
+                <w:noProof/>
+                <w:sz w:val="21"/>
+                <w:szCs w:val="21"/>
+              </w:rPr>
+            </w:pPr>
+            <w:r>
+              <w:rPr>
+                <w:b/>
+                <w:bCs/>
+                <w:noProof/>
+                <w:sz w:val="21"/>
+                <w:szCs w:val="21"/>
+              </w:rPr>
+              <w:t xml:space="preserve">Wave </w:t>
+            </w:r>
+            <w:r>
+              <w:rPr>
+                <w:b/>
+                <w:bCs/>
+                <w:noProof/>
+                <w:sz w:val="21"/>
+                <w:szCs w:val="21"/>
+              </w:rPr>
+              <w:t>3</w:t>
             </w:r>
           </w:p>
         </w:tc>
@@ -2440,18 +2507,9 @@
                 <w:sz w:val="21"/>
                 <w:szCs w:val="21"/>
               </w:rPr>
-              <w:t>Wave 2</w:t>
-            </w:r>
-          </w:p>
-        </w:tc>
-        <w:tc>
-          <w:tcPr>
-            <w:tcW w:w="3289" w:type="dxa"/>
-            <w:vAlign w:val="bottom"/>
-          </w:tcPr>
-          <w:p>
-            <w:pPr>
-              <w:jc w:val="center"/>
+              <w:t xml:space="preserve">Wave </w:t>
+            </w:r>
+            <w:r>
               <w:rPr>
                 <w:b/>
                 <w:bCs/>
@@ -2459,16 +2517,7 @@
                 <w:sz w:val="21"/>
                 <w:szCs w:val="21"/>
               </w:rPr>
-            </w:pPr>
-            <w:r>
-              <w:rPr>
-                <w:b/>
-                <w:bCs/>
-                <w:noProof/>
-                <w:sz w:val="21"/>
-                <w:szCs w:val="21"/>
-              </w:rPr>
-              <w:t>Wave 3</w:t>
+              <w:t>4</w:t>
             </w:r>
           </w:p>
         </w:tc>
@@ -2493,7 +2542,7 @@
         </w:tc>
         <w:tc>
           <w:tcPr>
-            <w:tcW w:w="3289" w:type="dxa"/>
+            <w:tcW w:w="2192" w:type="dxa"/>
           </w:tcPr>
           <w:p>
             <w:pPr>
@@ -2508,7 +2557,7 @@
                 <w:sz w:val="21"/>
                 <w:szCs w:val="21"/>
               </w:rPr>
-              <w:t>Total 5 round:</w:t>
+              <w:t>Total 3 round:</w:t>
             </w:r>
           </w:p>
           <w:p>
@@ -2524,21 +2573,158 @@
                 <w:sz w:val="21"/>
                 <w:szCs w:val="21"/>
               </w:rPr>
-              <w:t>Map s</w:t>
-            </w:r>
-            <w:r>
-              <w:rPr>
-                <w:sz w:val="21"/>
-                <w:szCs w:val="21"/>
-              </w:rPr>
-              <w:t>pawn rats</w:t>
-            </w:r>
-            <w:r>
-              <w:rPr>
-                <w:sz w:val="21"/>
-                <w:szCs w:val="21"/>
-              </w:rPr>
-              <w:t>,</w:t>
+              <w:t xml:space="preserve">Map spawn Rats, </w:t>
+            </w:r>
+            <w:r>
+              <w:rPr>
+                <w:sz w:val="21"/>
+                <w:szCs w:val="21"/>
+              </w:rPr>
+              <w:t>increasingly</w:t>
+            </w:r>
+            <w:r>
+              <w:rPr>
+                <w:sz w:val="21"/>
+                <w:szCs w:val="21"/>
+              </w:rPr>
+              <w:t xml:space="preserve"> from 2 to 5. </w:t>
+            </w:r>
+          </w:p>
+        </w:tc>
+        <w:tc>
+          <w:tcPr>
+            <w:tcW w:w="2193" w:type="dxa"/>
+          </w:tcPr>
+          <w:p>
+            <w:pPr>
+              <w:spacing w:before="120"/>
+              <w:rPr>
+                <w:sz w:val="21"/>
+                <w:szCs w:val="21"/>
+              </w:rPr>
+            </w:pPr>
+            <w:r>
+              <w:rPr>
+                <w:sz w:val="21"/>
+                <w:szCs w:val="21"/>
+              </w:rPr>
+              <w:t xml:space="preserve">Total </w:t>
+            </w:r>
+            <w:r>
+              <w:rPr>
+                <w:sz w:val="21"/>
+                <w:szCs w:val="21"/>
+              </w:rPr>
+              <w:t>2</w:t>
+            </w:r>
+            <w:r>
+              <w:rPr>
+                <w:sz w:val="21"/>
+                <w:szCs w:val="21"/>
+              </w:rPr>
+              <w:t xml:space="preserve"> round:</w:t>
+            </w:r>
+          </w:p>
+          <w:p>
+            <w:pPr>
+              <w:spacing w:before="120"/>
+              <w:rPr>
+                <w:sz w:val="21"/>
+                <w:szCs w:val="21"/>
+              </w:rPr>
+            </w:pPr>
+            <w:r>
+              <w:rPr>
+                <w:sz w:val="21"/>
+                <w:szCs w:val="21"/>
+              </w:rPr>
+              <w:t>Map spawn</w:t>
+            </w:r>
+            <w:r>
+              <w:rPr>
+                <w:sz w:val="21"/>
+                <w:szCs w:val="21"/>
+              </w:rPr>
+              <w:t xml:space="preserve"> White Slime</w:t>
+            </w:r>
+            <w:r>
+              <w:rPr>
+                <w:sz w:val="21"/>
+                <w:szCs w:val="21"/>
+              </w:rPr>
+              <w:t xml:space="preserve">, </w:t>
+            </w:r>
+            <w:r>
+              <w:rPr>
+                <w:sz w:val="21"/>
+                <w:szCs w:val="21"/>
+              </w:rPr>
+              <w:t>increasingly</w:t>
+            </w:r>
+            <w:r>
+              <w:rPr>
+                <w:sz w:val="21"/>
+                <w:szCs w:val="21"/>
+              </w:rPr>
+              <w:t xml:space="preserve"> from 2 to </w:t>
+            </w:r>
+            <w:r>
+              <w:rPr>
+                <w:sz w:val="21"/>
+                <w:szCs w:val="21"/>
+              </w:rPr>
+              <w:t>4</w:t>
+            </w:r>
+            <w:r>
+              <w:rPr>
+                <w:sz w:val="21"/>
+                <w:szCs w:val="21"/>
+              </w:rPr>
+              <w:t>.</w:t>
+            </w:r>
+          </w:p>
+        </w:tc>
+        <w:tc>
+          <w:tcPr>
+            <w:tcW w:w="2193" w:type="dxa"/>
+          </w:tcPr>
+          <w:p>
+            <w:pPr>
+              <w:spacing w:before="120"/>
+              <w:rPr>
+                <w:sz w:val="21"/>
+                <w:szCs w:val="21"/>
+              </w:rPr>
+            </w:pPr>
+            <w:r>
+              <w:rPr>
+                <w:sz w:val="21"/>
+                <w:szCs w:val="21"/>
+              </w:rPr>
+              <w:t>Total 2 round:</w:t>
+            </w:r>
+          </w:p>
+          <w:p>
+            <w:pPr>
+              <w:spacing w:before="120"/>
+              <w:rPr>
+                <w:sz w:val="21"/>
+                <w:szCs w:val="21"/>
+              </w:rPr>
+            </w:pPr>
+            <w:r>
+              <w:rPr>
+                <w:sz w:val="21"/>
+                <w:szCs w:val="21"/>
+              </w:rPr>
+              <w:t xml:space="preserve">Map spawn </w:t>
+            </w:r>
+            <w:r>
+              <w:rPr>
+                <w:sz w:val="21"/>
+                <w:szCs w:val="21"/>
+              </w:rPr>
+              <w:t>Grey</w:t>
             </w:r>
             <w:r>
               <w:rPr>
@@ -2552,6 +2738,20 @@
                 <w:sz w:val="21"/>
                 <w:szCs w:val="21"/>
               </w:rPr>
+              <w:t>S</w:t>
+            </w:r>
+            <w:r>
+              <w:rPr>
+                <w:sz w:val="21"/>
+                <w:szCs w:val="21"/>
+              </w:rPr>
+              <w:t xml:space="preserve">lime, </w:t>
+            </w:r>
+            <w:r>
+              <w:rPr>
+                <w:sz w:val="21"/>
+                <w:szCs w:val="21"/>
+              </w:rPr>
               <w:t>increasingly</w:t>
             </w:r>
             <w:r>
@@ -2559,7 +2759,7 @@
                 <w:sz w:val="21"/>
                 <w:szCs w:val="21"/>
               </w:rPr>
-              <w:t xml:space="preserve"> from 2 to 7.</w:t>
+              <w:t xml:space="preserve"> from 2 to 4.</w:t>
             </w:r>
           </w:p>
         </w:tc>
@@ -2571,171 +2771,34 @@
             <w:pPr>
               <w:spacing w:before="120"/>
               <w:rPr>
-                <w:sz w:val="21"/>
-                <w:szCs w:val="21"/>
-              </w:rPr>
-            </w:pPr>
-            <w:r>
-              <w:rPr>
-                <w:sz w:val="21"/>
-                <w:szCs w:val="21"/>
-              </w:rPr>
-              <w:t>Total 3 round:</w:t>
+                <w:noProof/>
+                <w:sz w:val="21"/>
+                <w:szCs w:val="21"/>
+              </w:rPr>
+            </w:pPr>
+            <w:r>
+              <w:rPr>
+                <w:noProof/>
+                <w:sz w:val="21"/>
+                <w:szCs w:val="21"/>
+              </w:rPr>
+              <w:t>Boss round:</w:t>
             </w:r>
           </w:p>
           <w:p>
             <w:pPr>
               <w:spacing w:before="120"/>
               <w:rPr>
-                <w:sz w:val="21"/>
-                <w:szCs w:val="21"/>
-              </w:rPr>
-            </w:pPr>
-            <w:r>
-              <w:rPr>
-                <w:sz w:val="21"/>
-                <w:szCs w:val="21"/>
-              </w:rPr>
-              <w:t xml:space="preserve">Enemy with total 5 ~ 8, random </w:t>
-            </w:r>
-            <w:r>
-              <w:rPr>
-                <w:sz w:val="21"/>
-                <w:szCs w:val="21"/>
-              </w:rPr>
-              <w:t>spawn</w:t>
-            </w:r>
-            <w:r>
-              <w:rPr>
-                <w:sz w:val="21"/>
-                <w:szCs w:val="21"/>
-              </w:rPr>
-              <w:t xml:space="preserve"> with</w:t>
-            </w:r>
-            <w:r>
-              <w:rPr>
-                <w:sz w:val="21"/>
-                <w:szCs w:val="21"/>
-              </w:rPr>
-              <w:t>in</w:t>
-            </w:r>
-            <w:r>
-              <w:rPr>
-                <w:sz w:val="21"/>
-                <w:szCs w:val="21"/>
-              </w:rPr>
-              <w:t xml:space="preserve"> white slime, grey slime and rat.</w:t>
-            </w:r>
-          </w:p>
-        </w:tc>
-        <w:tc>
-          <w:tcPr>
-            <w:tcW w:w="3289" w:type="dxa"/>
-          </w:tcPr>
-          <w:p>
-            <w:pPr>
-              <w:spacing w:before="120"/>
-              <w:rPr>
-                <w:noProof/>
-                <w:sz w:val="21"/>
-                <w:szCs w:val="21"/>
-              </w:rPr>
-            </w:pPr>
-            <w:r>
-              <w:rPr>
-                <w:noProof/>
-                <w:sz w:val="21"/>
-                <w:szCs w:val="21"/>
-              </w:rPr>
-              <w:t>Boss round:</w:t>
-            </w:r>
-          </w:p>
-          <w:p>
-            <w:pPr>
-              <w:spacing w:before="120"/>
-              <w:rPr>
-                <w:noProof/>
-              </w:rPr>
-            </w:pPr>
-            <w:r>
-              <w:rPr>
-                <w:noProof/>
-                <w:sz w:val="21"/>
-                <w:szCs w:val="21"/>
-              </w:rPr>
-              <w:t>Map s</w:t>
-            </w:r>
-            <w:r>
-              <w:rPr>
-                <w:noProof/>
-                <w:sz w:val="21"/>
-                <w:szCs w:val="21"/>
-              </w:rPr>
-              <w:t xml:space="preserve">pawn Slime </w:t>
-            </w:r>
-            <w:r>
-              <w:rPr>
-                <w:noProof/>
-                <w:sz w:val="21"/>
-                <w:szCs w:val="21"/>
-              </w:rPr>
-              <w:t>K</w:t>
-            </w:r>
-            <w:r>
-              <w:rPr>
-                <w:noProof/>
-                <w:sz w:val="21"/>
-                <w:szCs w:val="21"/>
-              </w:rPr>
-              <w:t>ing</w:t>
-            </w:r>
-            <w:r>
-              <w:rPr>
-                <w:noProof/>
-                <w:sz w:val="21"/>
-                <w:szCs w:val="21"/>
-              </w:rPr>
-              <w:t>,</w:t>
-            </w:r>
-            <w:r>
-              <w:rPr>
-                <w:noProof/>
-                <w:sz w:val="21"/>
-                <w:szCs w:val="21"/>
-              </w:rPr>
-              <w:t xml:space="preserve"> </w:t>
-            </w:r>
-            <w:r>
-              <w:rPr>
-                <w:noProof/>
-                <w:sz w:val="21"/>
-                <w:szCs w:val="21"/>
-              </w:rPr>
-              <w:t>and</w:t>
-            </w:r>
-            <w:r>
-              <w:rPr>
-                <w:noProof/>
-                <w:sz w:val="21"/>
-                <w:szCs w:val="21"/>
-              </w:rPr>
-              <w:t xml:space="preserve"> contin</w:t>
-            </w:r>
-            <w:r>
-              <w:rPr>
-                <w:noProof/>
-                <w:sz w:val="21"/>
-                <w:szCs w:val="21"/>
-              </w:rPr>
-              <w:t>ou</w:t>
-            </w:r>
-            <w:r>
-              <w:rPr>
-                <w:noProof/>
-                <w:sz w:val="21"/>
-                <w:szCs w:val="21"/>
-              </w:rPr>
-              <w:t>esly spawn rats in map boundary.</w:t>
+                <w:noProof/>
+              </w:rPr>
+            </w:pPr>
+            <w:r>
+              <w:rPr>
+                <w:noProof/>
+                <w:sz w:val="21"/>
+                <w:szCs w:val="21"/>
+              </w:rPr>
+              <w:t>Map spawn Slime King; continouesly spawn rats in map boundary.</w:t>
             </w:r>
           </w:p>
         </w:tc>
@@ -3677,27 +3740,7 @@
             <w:sz w:val="21"/>
             <w:szCs w:val="21"/>
           </w:rPr>
-          <w:t>https://git</w:t>
-        </w:r>
-        <w:r>
-          <w:rPr>
-            <w:rStyle w:val="Hyperlink"/>
-            <w:i/>
-            <w:iCs/>
-            <w:sz w:val="21"/>
-            <w:szCs w:val="21"/>
-          </w:rPr>
-          <w:t>h</w:t>
-        </w:r>
-        <w:r>
-          <w:rPr>
-            <w:rStyle w:val="Hyperlink"/>
-            <w:i/>
-            <w:iCs/>
-            <w:sz w:val="21"/>
-            <w:szCs w:val="21"/>
-          </w:rPr>
-          <w:t>ub.com/Repeating1212/Fall-Into-the-Unknown</w:t>
+          <w:t>https://github.com/Repeating1212/Fall-Into-the-Unknown</w:t>
         </w:r>
       </w:hyperlink>
     </w:p>

</xml_diff>